<commit_message>
Protocole IQ : la version relevée au journal doit égaler celle de l'interface
IQ-04 demande de relever le numéro annoncé au démarrage, IQ-07 exige qu'il soit
identique à celui affiché par la barre latérale. Le produit annonçait deux versions
différentes pour une même installation ; c'est corrigé côté produit, et le protocole
en fait désormais un contrôle explicite.

Co-Authored-By: Claude Opus 5 <noreply@anthropic.com>
</commit_message>
<xml_diff>
--- a/docs/Filum_IQ_protocol.docx
+++ b/docs/Filum_IQ_protocol.docx
@@ -1083,7 +1083,7 @@
                 <w:sz w:val="17"/>
                 <w:szCs w:val="17"/>
               </w:rPr>
-              <w:t xml:space="preserve">Migrations apply without error, the administrator account, the programme and the standards library are created, and the service reaches the healthy state (healthcheck).</w:t>
+              <w:t xml:space="preserve">Migrations apply without error, the administrator account, the programme and the standards library are created, and the service reaches the healthy state (healthcheck). Record the version number announced in the log: step IQ-07 will check it against the one displayed by the interface.</w:t>
             </w:r>
           </w:p>
         </w:tc>
@@ -1488,7 +1488,7 @@
                 <w:sz w:val="17"/>
                 <w:szCs w:val="17"/>
               </w:rPr>
-              <w:t xml:space="preserve">The change succeeds, signing in again with the old password fails, and the version number recorded is that of the delivery. Without this step, signatures are not attributable to the holder alone.</w:t>
+              <w:t xml:space="preserve">The change succeeds, signing in again with the old password fails, and the version number recorded is that of the delivery — IDENTICAL to the one announced in the log at step IQ-04. Without this step, signatures are not attributable to the holder alone.</w:t>
             </w:r>
           </w:p>
         </w:tc>

</xml_diff>

<commit_message>
Protocole IQ : l'étape IQ-02 vérifie l'archive avant de la charger
Elle nommait un fichier qui n'existait pas et sautait le contrôle de transport.
Elle exige désormais deux empreintes : celle de l'archive, vérifiable sans Docker
avant tout chargement, et celle de l'image après chargement.

Co-Authored-By: Claude Opus 5 <noreply@anthropic.com>
</commit_message>
<xml_diff>
--- a/docs/Filum_IQ_protocol.docx
+++ b/docs/Filum_IQ_protocol.docx
@@ -790,7 +790,7 @@
                 <w:sz w:val="17"/>
                 <w:szCs w:val="17"/>
               </w:rPr>
-              <w:t xml:space="preserve">Load the image archive (`docker load -i filum-image.tar`) and record the identifier and digest of the resulting image (`docker images --digests`).</w:t>
+              <w:t xml:space="preserve">First check the digest of the ARCHIVE received, without Docker: `sha256sum -c filum-&lt;version&gt;.tar.gz.sha256`, or on Windows `Get-FileHash filum-&lt;version&gt;.tar.gz -Algorithm SHA256`. Then load it: `docker load -i filum-&lt;version&gt;.tar.gz`, and record the identifier of the resulting image: `docker image inspect filum:latest --format '{{.ID}}'`.</w:t>
             </w:r>
           </w:p>
         </w:tc>
@@ -813,7 +813,7 @@
                 <w:sz w:val="17"/>
                 <w:szCs w:val="17"/>
               </w:rPr>
-              <w:t xml:space="preserve">The digest recorded matches the one communicated by the vendor with the delivery.</w:t>
+              <w:t xml:space="preserve">BOTH digests match those communicated by the vendor: the archive digest attests that the delivery is intact, the image digest attests that this is indeed the image the vendor built. Do not rebuild the image to check — two builds of the same code yield different digests, and the comparison would fail on a delivery that is in fact intact.</w:t>
             </w:r>
           </w:p>
         </w:tc>

</xml_diff>